<commit_message>
Set up Car Rental Project using Java-17 and JDK: Temurin-21
</commit_message>
<xml_diff>
--- a/ProjectMilestone1Documentation/Feature Outline to Assign Work.docx
+++ b/ProjectMilestone1Documentation/Feature Outline to Assign Work.docx
@@ -54,14 +54,7 @@
                 <w:b/>
                 <w:bCs/>
               </w:rPr>
-              <w:t>Rate</w:t>
-            </w:r>
-            <w:r>
-              <w:rPr>
-                <w:b/>
-                <w:bCs/>
-              </w:rPr>
-              <w:t xml:space="preserve"> (Per Day)</w:t>
+              <w:t>Rate (Per Day)</w:t>
             </w:r>
           </w:p>
         </w:tc>
@@ -575,13 +568,7 @@
         </w:numPr>
       </w:pPr>
       <w:r>
-        <w:t xml:space="preserve">If Users Age </w:t>
-      </w:r>
-      <w:r>
-        <w:t>&lt;</w:t>
-      </w:r>
-      <w:r>
-        <w:t xml:space="preserve"> 25 (Ask User to Pick Vehicle to Rent)</w:t>
+        <w:t>If Users Age &lt; 25 (Ask User to Pick Vehicle to Rent)</w:t>
       </w:r>
     </w:p>
     <w:p>

</xml_diff>